<commit_message>
Fix demo back-links that 404'd after the locale restructure
Moving language into the URL made every page live under /{locale}, but
the demos were built earlier and their "back to portfolio" buttons still
pointed at /projects/<slug>, which no longer resolves. 42 links across
the four demos now point at /en/projects/<slug>, and _redirects sends the
old form there too so anything already shared keeps working.

Also repoints 26 BusCatcher demo pages at the site favicon; they
referenced assets/img/favicon/favicon.ico, which never existed in the
source project either.

Co-Authored-By: Claude Opus 5 <noreply@anthropic.com>
</commit_message>
<xml_diff>
--- a/docs/Portfolio_Issues_and_Fixes.docx
+++ b/docs/Portfolio_Issues_and_Fixes.docx
@@ -1059,6 +1059,65 @@
                 <w:color w:val="6D5F8C"/>
               </w:rPr>
               <w:t>Laravel always generates absolute URLs from a configured base address. Rewriting them to root-relative means the same build works on the live domain, on the temporary Netlify address, and on the per-commit preview builds — without the export needing to know where it will be hosted</w:t>
+            </w:r>
+          </w:p>
+        </w:tc>
+      </w:tr>
+      <w:tr>
+        <w:tc>
+          <w:tcPr>
+            <w:cnfStyle w:val="001000000000" w:firstRow="0" w:lastRow="0" w:firstColumn="1" w:lastColumn="0" w:oddVBand="0" w:evenVBand="0" w:oddHBand="0" w:evenHBand="0" w:firstRowFirstColumn="0" w:firstRowLastColumn="0" w:lastRowFirstColumn="0" w:lastRowLastColumn="0"/>
+            <w:tcW w:w="2000" w:type="dxa"/>
+          </w:tcPr>
+          <w:p>
+            <w:pPr>
+              <w:rPr>
+                <w:color w:val="2F2447"/>
+              </w:rPr>
+            </w:pPr>
+            <w:r>
+              <w:rPr>
+                <w:color w:val="2F2447"/>
+              </w:rPr>
+              <w:t xml:space="preserve">Every demo's "back to portfolio" button led to a "Page not found"</w:t>
+            </w:r>
+          </w:p>
+        </w:tc>
+        <w:tc>
+          <w:tcPr>
+            <w:tcW w:w="2200" w:type="dxa"/>
+          </w:tcPr>
+          <w:p>
+            <w:pPr>
+              <w:cnfStyle w:val="000000000000" w:firstRow="0" w:lastRow="0" w:firstColumn="0" w:lastColumn="0" w:oddVBand="0" w:evenVBand="0" w:oddHBand="0" w:evenHBand="0" w:firstRowFirstColumn="0" w:firstRowLastColumn="0" w:lastRowFirstColumn="0" w:lastRowLastColumn="0"/>
+              <w:rPr>
+                <w:color w:val="443761"/>
+              </w:rPr>
+            </w:pPr>
+            <w:r>
+              <w:rPr>
+                <w:color w:val="443761"/>
+              </w:rPr>
+              <w:t xml:space="preserve">Pointed the links at the current page addresses, and added a redirect so links already shared keep working</w:t>
+            </w:r>
+          </w:p>
+        </w:tc>
+        <w:tc>
+          <w:tcPr>
+            <w:tcW w:w="6266" w:type="dxa"/>
+          </w:tcPr>
+          <w:p>
+            <w:pPr>
+              <w:cnfStyle w:val="000000000000" w:firstRow="0" w:lastRow="0" w:firstColumn="0" w:lastColumn="0" w:oddVBand="0" w:evenVBand="0" w:oddHBand="0" w:evenHBand="0" w:firstRowFirstColumn="0" w:firstRowLastColumn="0" w:lastRowFirstColumn="0" w:lastRowLastColumn="0"/>
+              <w:rPr>
+                <w:color w:val="6D5F8C"/>
+              </w:rPr>
+            </w:pPr>
+            <w:r>
+              <w:rPr>
+                <w:color w:val="6D5F8C"/>
+              </w:rPr>
+              <w:t xml:space="preserve">The demos were built before the site moved language into the address, so their links still pointed at /projects/... instead of /en/projects/.... Forty-two links across the four demos were corrected, and the old form now redirects rather than failing, so anything already sent out still lands in the right place</w:t>
             </w:r>
           </w:p>
         </w:tc>

</xml_diff>